<commit_message>
Atualização do relatório do plano de testes
</commit_message>
<xml_diff>
--- a/RELATÓRIO - plano de testes.docx
+++ b/RELATÓRIO - plano de testes.docx
@@ -41,7 +41,15 @@
         <w:t>Projeto:</w:t>
       </w:r>
       <w:r>
-        <w:t xml:space="preserve"> Collection System Web (v2.0.</w:t>
+        <w:t xml:space="preserve"> </w:t>
+      </w:r>
+      <w:proofErr w:type="spellStart"/>
+      <w:r>
+        <w:t>Collection</w:t>
+      </w:r>
+      <w:proofErr w:type="spellEnd"/>
+      <w:r>
+        <w:t xml:space="preserve"> System Web (v2.0.</w:t>
       </w:r>
       <w:r>
         <w:t>1</w:t>
@@ -94,10 +102,50 @@
           <w:b/>
           <w:bCs/>
         </w:rPr>
-        <w:t>Testes de Unidade Automatizados (JUnit 5):</w:t>
-      </w:r>
-      <w:r>
-        <w:t xml:space="preserve"> Focados exclusivamente na classe UsuarioService. Validamos os métodos de controle de dados (registrarNovoUsuario e autenticarUsuario) de forma totalmente isolada. Seguindo rigorosamente as diretrizes da atividade, esses testes de unidade dispensam qualquer conexão com o banco de dados MySQL para focar na lógica pura de negócio.</w:t>
+        <w:t>Testes de Unidade Automatizados (</w:t>
+      </w:r>
+      <w:proofErr w:type="spellStart"/>
+      <w:r>
+        <w:rPr>
+          <w:b/>
+          <w:bCs/>
+        </w:rPr>
+        <w:t>JUnit</w:t>
+      </w:r>
+      <w:proofErr w:type="spellEnd"/>
+      <w:r>
+        <w:rPr>
+          <w:b/>
+          <w:bCs/>
+        </w:rPr>
+        <w:t xml:space="preserve"> 5):</w:t>
+      </w:r>
+      <w:r>
+        <w:t xml:space="preserve"> Focados exclusivamente na classe </w:t>
+      </w:r>
+      <w:proofErr w:type="spellStart"/>
+      <w:r>
+        <w:t>UsuarioService</w:t>
+      </w:r>
+      <w:proofErr w:type="spellEnd"/>
+      <w:r>
+        <w:t>. Validamos os métodos de controle de dados (</w:t>
+      </w:r>
+      <w:proofErr w:type="spellStart"/>
+      <w:r>
+        <w:t>registrarNovoUsuario</w:t>
+      </w:r>
+      <w:proofErr w:type="spellEnd"/>
+      <w:r>
+        <w:t xml:space="preserve"> e </w:t>
+      </w:r>
+      <w:proofErr w:type="spellStart"/>
+      <w:r>
+        <w:t>autenticarUsuario</w:t>
+      </w:r>
+      <w:proofErr w:type="spellEnd"/>
+      <w:r>
+        <w:t>) de forma totalmente isolada. Seguindo rigorosamente as diretrizes da atividade, esses testes de unidade dispensam qualquer conexão com o banco de dados MySQL para focar na lógica pura de negócio.</w:t>
       </w:r>
     </w:p>
     <w:p>
@@ -350,7 +398,15 @@
           </w:tcPr>
           <w:p>
             <w:r>
-              <w:t>Enviar Nome completo, Username inédito e Senha válida. Executar a operação.</w:t>
+              <w:t xml:space="preserve">Enviar Nome completo, </w:t>
+            </w:r>
+            <w:proofErr w:type="spellStart"/>
+            <w:r>
+              <w:t>Username</w:t>
+            </w:r>
+            <w:proofErr w:type="spellEnd"/>
+            <w:r>
+              <w:t xml:space="preserve"> inédito e Senha válida. Executar a operação.</w:t>
             </w:r>
           </w:p>
         </w:tc>
@@ -570,7 +626,15 @@
           </w:tcPr>
           <w:p>
             <w:r>
-              <w:t>Preencher os campos com o Username e a Senha corretos de um usuário já existente no banco de dados.</w:t>
+              <w:t xml:space="preserve">Preencher os campos com o </w:t>
+            </w:r>
+            <w:proofErr w:type="spellStart"/>
+            <w:r>
+              <w:t>Username</w:t>
+            </w:r>
+            <w:proofErr w:type="spellEnd"/>
+            <w:r>
+              <w:t xml:space="preserve"> e a Senha corretos de um usuário já existente no banco de dados.</w:t>
             </w:r>
           </w:p>
         </w:tc>
@@ -674,8 +738,13 @@
             <w:hideMark/>
           </w:tcPr>
           <w:p>
-            <w:r>
-              <w:t>Criar uma nova coleção informando o título desejado e associando-a ao ID numérico do usuário que está autenticado no momento.</w:t>
+            <w:proofErr w:type="gramStart"/>
+            <w:r>
+              <w:t>Criar uma nova</w:t>
+            </w:r>
+            <w:proofErr w:type="gramEnd"/>
+            <w:r>
+              <w:t xml:space="preserve"> coleção informando o título desejado e associando-a ao ID numérico do usuário que está autenticado no momento.</w:t>
             </w:r>
           </w:p>
         </w:tc>
@@ -780,7 +849,15 @@
           </w:tcPr>
           <w:p>
             <w:r>
-              <w:t>Inserir um novo jogo associando o título, gênero e as IDs da Coleção e da Desenvolvedora correspondentes.</w:t>
+              <w:t xml:space="preserve">Inserir um novo jogo associando o título, gênero e as </w:t>
+            </w:r>
+            <w:proofErr w:type="spellStart"/>
+            <w:r>
+              <w:t>IDs</w:t>
+            </w:r>
+            <w:proofErr w:type="spellEnd"/>
+            <w:r>
+              <w:t xml:space="preserve"> da Coleção e da Desenvolvedora correspondentes.</w:t>
             </w:r>
           </w:p>
         </w:tc>
@@ -846,7 +923,15 @@
         <w:t>Nome do Repositório:</w:t>
       </w:r>
       <w:r>
-        <w:t xml:space="preserve"> Collection System Web</w:t>
+        <w:t xml:space="preserve"> </w:t>
+      </w:r>
+      <w:proofErr w:type="spellStart"/>
+      <w:r>
+        <w:t>Collection</w:t>
+      </w:r>
+      <w:proofErr w:type="spellEnd"/>
+      <w:r>
+        <w:t xml:space="preserve"> System Web</w:t>
       </w:r>
     </w:p>
     <w:p>
@@ -864,8 +949,13 @@
         <w:t>Branch Principal:</w:t>
       </w:r>
       <w:r>
-        <w:t xml:space="preserve"> main</w:t>
-      </w:r>
+        <w:t xml:space="preserve"> </w:t>
+      </w:r>
+      <w:proofErr w:type="spellStart"/>
+      <w:r>
+        <w:t>main</w:t>
+      </w:r>
+      <w:proofErr w:type="spellEnd"/>
     </w:p>
     <w:p>
       <w:pPr>
@@ -882,7 +972,103 @@
         <w:t>Diretório do Teste:</w:t>
       </w:r>
       <w:r>
-        <w:t xml:space="preserve"> Mapeado na pasta nativa de testes do projeto (test/service/UsuarioServiceTest.java).</w:t>
+        <w:t xml:space="preserve"> Mapeado na pasta nativa de testes do projeto (</w:t>
+      </w:r>
+      <w:proofErr w:type="spellStart"/>
+      <w:r>
+        <w:t>test</w:t>
+      </w:r>
+      <w:proofErr w:type="spellEnd"/>
+      <w:r>
+        <w:t>/</w:t>
+      </w:r>
+      <w:proofErr w:type="spellStart"/>
+      <w:r>
+        <w:t>service</w:t>
+      </w:r>
+      <w:proofErr w:type="spellEnd"/>
+      <w:r>
+        <w:t>/UsuarioServiceTest.java).</w:t>
+      </w:r>
+      <w:r>
+        <w:rPr>
+          <w:noProof/>
+        </w:rPr>
+        <w:t xml:space="preserve"> </w:t>
+      </w:r>
+      <w:r>
+        <w:drawing>
+          <wp:inline distT="0" distB="0" distL="0" distR="0" wp14:anchorId="0739FF7A" wp14:editId="0F2FB703">
+            <wp:extent cx="5400040" cy="2008505"/>
+            <wp:effectExtent l="0" t="0" r="0" b="0"/>
+            <wp:docPr id="1722351004" name="Imagem 1"/>
+            <wp:cNvGraphicFramePr>
+              <a:graphicFrameLocks xmlns:a="http://schemas.openxmlformats.org/drawingml/2006/main" noChangeAspect="1"/>
+            </wp:cNvGraphicFramePr>
+            <a:graphic xmlns:a="http://schemas.openxmlformats.org/drawingml/2006/main">
+              <a:graphicData uri="http://schemas.openxmlformats.org/drawingml/2006/picture">
+                <pic:pic xmlns:pic="http://schemas.openxmlformats.org/drawingml/2006/picture">
+                  <pic:nvPicPr>
+                    <pic:cNvPr id="1722351004" name=""/>
+                    <pic:cNvPicPr/>
+                  </pic:nvPicPr>
+                  <pic:blipFill>
+                    <a:blip r:embed="rId5"/>
+                    <a:stretch>
+                      <a:fillRect/>
+                    </a:stretch>
+                  </pic:blipFill>
+                  <pic:spPr>
+                    <a:xfrm>
+                      <a:off x="0" y="0"/>
+                      <a:ext cx="5400040" cy="2008505"/>
+                    </a:xfrm>
+                    <a:prstGeom prst="rect">
+                      <a:avLst/>
+                    </a:prstGeom>
+                  </pic:spPr>
+                </pic:pic>
+              </a:graphicData>
+            </a:graphic>
+          </wp:inline>
+        </w:drawing>
+      </w:r>
+      <w:r>
+        <w:drawing>
+          <wp:inline distT="0" distB="0" distL="0" distR="0" wp14:anchorId="7E3547B5" wp14:editId="14D1C65C">
+            <wp:extent cx="5400040" cy="1768475"/>
+            <wp:effectExtent l="0" t="0" r="0" b="3175"/>
+            <wp:docPr id="1115426772" name="Imagem 1"/>
+            <wp:cNvGraphicFramePr>
+              <a:graphicFrameLocks xmlns:a="http://schemas.openxmlformats.org/drawingml/2006/main" noChangeAspect="1"/>
+            </wp:cNvGraphicFramePr>
+            <a:graphic xmlns:a="http://schemas.openxmlformats.org/drawingml/2006/main">
+              <a:graphicData uri="http://schemas.openxmlformats.org/drawingml/2006/picture">
+                <pic:pic xmlns:pic="http://schemas.openxmlformats.org/drawingml/2006/picture">
+                  <pic:nvPicPr>
+                    <pic:cNvPr id="1115426772" name=""/>
+                    <pic:cNvPicPr/>
+                  </pic:nvPicPr>
+                  <pic:blipFill>
+                    <a:blip r:embed="rId6"/>
+                    <a:stretch>
+                      <a:fillRect/>
+                    </a:stretch>
+                  </pic:blipFill>
+                  <pic:spPr>
+                    <a:xfrm>
+                      <a:off x="0" y="0"/>
+                      <a:ext cx="5400040" cy="1768475"/>
+                    </a:xfrm>
+                    <a:prstGeom prst="rect">
+                      <a:avLst/>
+                    </a:prstGeom>
+                  </pic:spPr>
+                </pic:pic>
+              </a:graphicData>
+            </a:graphic>
+          </wp:inline>
+        </w:drawing>
       </w:r>
     </w:p>
     <w:p>
@@ -890,7 +1076,9 @@
         <w:rPr>
           <w:i/>
           <w:iCs/>
+          <w:noProof/>
         </w:rPr>
+        <w:lastRenderedPageBreak/>
         <w:drawing>
           <wp:inline distT="0" distB="0" distL="0" distR="0" wp14:anchorId="56079A96" wp14:editId="7CC25EFB">
             <wp:extent cx="4982270" cy="3553321"/>
@@ -907,7 +1095,7 @@
                     <pic:cNvPicPr/>
                   </pic:nvPicPr>
                   <pic:blipFill>
-                    <a:blip r:embed="rId5"/>
+                    <a:blip r:embed="rId7"/>
                     <a:stretch>
                       <a:fillRect/>
                     </a:stretch>
@@ -928,6 +1116,9 @@
         </w:drawing>
       </w:r>
       <w:r>
+        <w:rPr>
+          <w:noProof/>
+        </w:rPr>
         <w:drawing>
           <wp:inline distT="0" distB="0" distL="0" distR="0" wp14:anchorId="3A1E1528" wp14:editId="25584C02">
             <wp:extent cx="5400040" cy="2671445"/>
@@ -944,7 +1135,7 @@
                     <pic:cNvPicPr/>
                   </pic:nvPicPr>
                   <pic:blipFill>
-                    <a:blip r:embed="rId6"/>
+                    <a:blip r:embed="rId8"/>
                     <a:stretch>
                       <a:fillRect/>
                     </a:stretch>
@@ -1887,6 +2078,7 @@
   <w:style w:type="character" w:default="1" w:styleId="Fontepargpadro">
     <w:name w:val="Default Paragraph Font"/>
     <w:uiPriority w:val="1"/>
+    <w:semiHidden/>
     <w:unhideWhenUsed/>
   </w:style>
   <w:style w:type="table" w:default="1" w:styleId="Tabelanormal">

</xml_diff>